<commit_message>
Complete Week 4 Stage 1 lab
</commit_message>
<xml_diff>
--- a/week4/Stage_1_Lab_Student_Handout.docx
+++ b/week4/Stage_1_Lab_Student_Handout.docx
@@ -1,6 +1,6 @@
 
 <file path=word/document.xml><?xml version="1.0" encoding="utf-8"?>
-<w:document xmlns:wpc="http://schemas.microsoft.com/office/word/2010/wordprocessingCanvas" xmlns:cx="http://schemas.microsoft.com/office/drawing/2014/chartex" xmlns:cx1="http://schemas.microsoft.com/office/drawing/2015/9/8/chartex" xmlns:cx2="http://schemas.microsoft.com/office/drawing/2015/10/21/chartex" xmlns:cx3="http://schemas.microsoft.com/office/drawing/2016/5/9/chartex" xmlns:cx4="http://schemas.microsoft.com/office/drawing/2016/5/10/chartex" xmlns:cx5="http://schemas.microsoft.com/office/drawing/2016/5/11/chartex" xmlns:cx6="http://schemas.microsoft.com/office/drawing/2016/5/12/chartex" xmlns:cx7="http://schemas.microsoft.com/office/drawing/2016/5/13/chartex" xmlns:cx8="http://schemas.microsoft.com/office/drawing/2016/5/14/chartex" xmlns:mc="http://schemas.openxmlformats.org/markup-compatibility/2006" xmlns:aink="http://schemas.microsoft.com/office/drawing/2016/ink" xmlns:am3d="http://schemas.microsoft.com/office/drawing/2017/model3d" xmlns:o="urn:schemas-microsoft-com:office:office" xmlns:oel="http://schemas.microsoft.com/office/2019/extlst" xmlns:r="http://schemas.openxmlformats.org/officeDocument/2006/relationships" xmlns:m="http://schemas.openxmlformats.org/officeDocument/2006/math" xmlns:v="urn:schemas-microsoft-com:vml" xmlns:wp14="http://schemas.microsoft.com/office/word/2010/wordprocessingDrawing" xmlns:wp="http://schemas.openxmlformats.org/drawingml/2006/wordprocessingDrawing" xmlns:w10="urn:schemas-microsoft-com:office:word" xmlns:w="http://schemas.openxmlformats.org/wordprocessingml/2006/main" xmlns:w14="http://schemas.microsoft.com/office/word/2010/wordml" xmlns:w15="http://schemas.microsoft.com/office/word/2012/wordml" xmlns:w16cei="http://schemas.microsoft.com/office/word/2026/wordml/cei" xmlns:w16cex="http://schemas.microsoft.com/office/word/2018/wordml/cex" xmlns:w16cid="http://schemas.microsoft.com/office/word/2016/wordml/cid" xmlns:w16="http://schemas.microsoft.com/office/word/2018/wordml" xmlns:w16du="http://schemas.microsoft.com/office/word/2023/wordml/word16du" xmlns:w16sdtdh="http://schemas.microsoft.com/office/word/2020/wordml/sdtdatahash" xmlns:w16sdtfl="http://schemas.microsoft.com/office/word/2024/wordml/sdtformatlock" xmlns:w16se="http://schemas.microsoft.com/office/word/2015/wordml/symex" xmlns:wpg="http://schemas.microsoft.com/office/word/2010/wordprocessingGroup" xmlns:wpi="http://schemas.microsoft.com/office/word/2010/wordprocessingInk" xmlns:wne="http://schemas.microsoft.com/office/word/2006/wordml" xmlns:wps="http://schemas.microsoft.com/office/word/2010/wordprocessingShape" mc:Ignorable="w14 w15 w16se w16cid w16 w16cex w16sdtdh w16sdtfl w16du wp14">
+<w:document xmlns:wpc="http://schemas.microsoft.com/office/word/2010/wordprocessingCanvas" xmlns:cx="http://schemas.microsoft.com/office/drawing/2014/chartex" xmlns:cx1="http://schemas.microsoft.com/office/drawing/2015/9/8/chartex" xmlns:cx2="http://schemas.microsoft.com/office/drawing/2015/10/21/chartex" xmlns:cx3="http://schemas.microsoft.com/office/drawing/2016/5/9/chartex" xmlns:cx4="http://schemas.microsoft.com/office/drawing/2016/5/10/chartex" xmlns:cx5="http://schemas.microsoft.com/office/drawing/2016/5/11/chartex" xmlns:cx6="http://schemas.microsoft.com/office/drawing/2016/5/12/chartex" xmlns:cx7="http://schemas.microsoft.com/office/drawing/2016/5/13/chartex" xmlns:cx8="http://schemas.microsoft.com/office/drawing/2016/5/14/chartex" xmlns:mc="http://schemas.openxmlformats.org/markup-compatibility/2006" xmlns:aink="http://schemas.microsoft.com/office/drawing/2016/ink" xmlns:am3d="http://schemas.microsoft.com/office/drawing/2017/model3d" xmlns:o="urn:schemas-microsoft-com:office:office" xmlns:oel="http://schemas.microsoft.com/office/2019/extlst" xmlns:r="http://schemas.openxmlformats.org/officeDocument/2006/relationships" xmlns:m="http://schemas.openxmlformats.org/officeDocument/2006/math" xmlns:v="urn:schemas-microsoft-com:vml" xmlns:wp14="http://schemas.microsoft.com/office/word/2010/wordprocessingDrawing" xmlns:wp="http://schemas.openxmlformats.org/drawingml/2006/wordprocessingDrawing" xmlns:w10="urn:schemas-microsoft-com:office:word" xmlns:w="http://schemas.openxmlformats.org/wordprocessingml/2006/main" xmlns:w14="http://schemas.microsoft.com/office/word/2010/wordml" xmlns:w15="http://schemas.microsoft.com/office/word/2012/wordml" xmlns:w16cex="http://schemas.microsoft.com/office/word/2018/wordml/cex" xmlns:w16cid="http://schemas.microsoft.com/office/word/2016/wordml/cid" xmlns:w16="http://schemas.microsoft.com/office/word/2018/wordml" xmlns:w16du="http://schemas.microsoft.com/office/word/2023/wordml/word16du" xmlns:w16sdtdh="http://schemas.microsoft.com/office/word/2020/wordml/sdtdatahash" xmlns:w16sdtfl="http://schemas.microsoft.com/office/word/2024/wordml/sdtformatlock" xmlns:w16se="http://schemas.microsoft.com/office/word/2015/wordml/symex" xmlns:wpg="http://schemas.microsoft.com/office/word/2010/wordprocessingGroup" xmlns:wpi="http://schemas.microsoft.com/office/word/2010/wordprocessingInk" xmlns:wne="http://schemas.microsoft.com/office/word/2006/wordml" xmlns:wps="http://schemas.microsoft.com/office/word/2010/wordprocessingShape" mc:Ignorable="w14 w15 w16se w16cid w16 w16cex w16sdtdh w16sdtfl w16du wp14">
   <w:body>
     <w:p>
       <w:pPr>
@@ -8,16 +8,7 @@
         <w:jc w:val="center"/>
       </w:pPr>
       <w:r>
-        <w:t xml:space="preserve">Stage </w:t>
-      </w:r>
-      <w:r>
-        <w:t>1</w:t>
-      </w:r>
-      <w:r>
-        <w:t xml:space="preserve"> Lab</w:t>
-      </w:r>
-      <w:r>
-        <w:t xml:space="preserve"> - Human vs AI: Building Your First SmartCare Prototype</w:t>
+        <w:t>Stage 1 Lab - Human vs AI: Building Your First SmartCare Prototype</w:t>
       </w:r>
     </w:p>
     <w:p>
@@ -103,10 +94,7 @@
     </w:p>
     <w:p>
       <w:r>
-        <w:t>stage</w:t>
-      </w:r>
-      <w:r>
-        <w:t>01/</w:t>
+        <w:t>stage01/</w:t>
       </w:r>
       <w:r>
         <w:br/>
@@ -145,7 +133,17 @@
     </w:p>
     <w:p>
       <w:r>
+        <w:t>Patient name, practitioner name and appointment time</w:t>
+      </w:r>
+    </w:p>
+    <w:p>
+      <w:r>
         <w:t>What functions might be useful?</w:t>
+      </w:r>
+    </w:p>
+    <w:p>
+      <w:r>
+        <w:t>A function to book an appointment and a function to display the recorded appointments</w:t>
       </w:r>
     </w:p>
     <w:p>
@@ -155,14 +153,25 @@
     </w:p>
     <w:p>
       <w:r>
+        <w:t>The patient name could be blank, incorrect information could be entered, or two appointments could be booked for the same practitioner at the same time</w:t>
+      </w:r>
+    </w:p>
+    <w:p>
+      <w:r>
         <w:t>What requirements are unclear?</w:t>
       </w:r>
     </w:p>
     <w:p>
+      <w:r>
+        <w:t>It is unclear whether the system should prevent duplicate appointments, what information besides names and time should be stored, and how appointments should be changed or cancelled</w:t>
+      </w:r>
+    </w:p>
+    <w:p>
       <w:pPr>
         <w:pStyle w:val="Heading1"/>
       </w:pPr>
       <w:r>
+        <w:lastRenderedPageBreak/>
         <w:t>Part B - Build a Human-Written Prototype: AI OFF</w:t>
       </w:r>
     </w:p>
@@ -340,7 +349,6 @@
           <w:b/>
           <w:bCs/>
         </w:rPr>
-        <w:lastRenderedPageBreak/>
         <w:t>print(f"Patient: {patient1_name} | Practitioner: {practitioner1_name} | Time: {appointment1_time}")</w:t>
       </w:r>
     </w:p>
@@ -933,6 +941,7 @@
           <w:bCs/>
           <w:lang w:val="en-AU"/>
         </w:rPr>
+        <w:lastRenderedPageBreak/>
         <w:t>display_appointments()</w:t>
       </w:r>
     </w:p>
@@ -952,18 +961,73 @@
     </w:p>
     <w:p>
       <w:pPr>
-        <w:rPr>
-          <w:color w:val="C00000"/>
-        </w:rPr>
-      </w:pPr>
+        <w:pStyle w:val="ListParagraph"/>
+        <w:numPr>
+          <w:ilvl w:val="0"/>
+          <w:numId w:val="10"/>
+        </w:numPr>
+      </w:pPr>
+      <w:r>
+        <w:t>The appointments are hard-coded, so the receptionist cannot enter appointment details while the program is running.</w:t>
+      </w:r>
     </w:p>
     <w:p>
       <w:pPr>
+        <w:pStyle w:val="ListParagraph"/>
+        <w:numPr>
+          <w:ilvl w:val="0"/>
+          <w:numId w:val="10"/>
+        </w:numPr>
+      </w:pPr>
+      <w:r>
+        <w:t>The program does not prevent duplicate appointments for the same practitioner at the same time.</w:t>
+      </w:r>
+    </w:p>
+    <w:p>
+      <w:pPr>
+        <w:pStyle w:val="ListParagraph"/>
+        <w:numPr>
+          <w:ilvl w:val="0"/>
+          <w:numId w:val="10"/>
+        </w:numPr>
+      </w:pPr>
+      <w:r>
+        <w:t>Only the patient name is checked, while the practitioner name and appointment time are not validated.</w:t>
+      </w:r>
+    </w:p>
+    <w:p>
+      <w:pPr>
+        <w:pStyle w:val="ListParagraph"/>
+        <w:numPr>
+          <w:ilvl w:val="0"/>
+          <w:numId w:val="10"/>
+        </w:numPr>
+      </w:pPr>
+      <w:r>
+        <w:t>Appointments are only stored temporarily in memory, so the information is lost when the program closes.</w:t>
+      </w:r>
+    </w:p>
+    <w:p>
+      <w:pPr>
+        <w:pStyle w:val="ListParagraph"/>
+        <w:numPr>
+          <w:ilvl w:val="0"/>
+          <w:numId w:val="10"/>
+        </w:numPr>
+      </w:pPr>
+      <w:r>
+        <w:t>There is no way to edit or cancel an appointment after it has been recorded.</w:t>
+      </w:r>
+    </w:p>
+    <w:p>
+      <w:pPr>
         <w:pStyle w:val="Heading1"/>
       </w:pPr>
       <w:r>
-        <w:lastRenderedPageBreak/>
-        <w:t>Part C - Use AI as Tutor: AI ON</w:t>
+        <w:t>P</w:t>
+      </w:r>
+      <w:r>
+        <w:t>art C - Use AI as Tutor: AI ON</w:t>
       </w:r>
       <w:r>
         <w:t xml:space="preserve"> (Use </w:t>
@@ -1026,19 +1090,165 @@
       </w:r>
       <w:r>
         <w:br/>
+      </w:r>
+      <w:r>
         <w:t>4. Do not rewrite the whole application.</w:t>
       </w:r>
       <w:r>
         <w:br/>
         <w:t>5. Ask me two questions to test my understanding.</w:t>
       </w:r>
+      <w:r>
+        <w:t>\</w:t>
+      </w:r>
     </w:p>
     <w:p>
+      <w:r>
+        <w:t xml:space="preserve">Copilot response: </w:t>
+      </w:r>
+    </w:p>
+    <w:p>
+      <w:r>
+        <w:lastRenderedPageBreak/>
+        <w:drawing>
+          <wp:inline distT="0" distB="0" distL="0" distR="0" wp14:anchorId="050811D7" wp14:editId="51F3FD3E">
+            <wp:extent cx="6400800" cy="5956935"/>
+            <wp:effectExtent l="0" t="0" r="0" b="5715"/>
+            <wp:docPr id="1343994225" name="Picture 1" descr="The code defines a function to create and store a medical appointment in a list, checking for a non-empty patient name.&#10;&#10;AI-generated content may be incorrect."/>
+            <wp:cNvGraphicFramePr>
+              <a:graphicFrameLocks xmlns:a="http://schemas.openxmlformats.org/drawingml/2006/main" noChangeAspect="1"/>
+            </wp:cNvGraphicFramePr>
+            <a:graphic xmlns:a="http://schemas.openxmlformats.org/drawingml/2006/main">
+              <a:graphicData uri="http://schemas.openxmlformats.org/drawingml/2006/picture">
+                <pic:pic xmlns:pic="http://schemas.openxmlformats.org/drawingml/2006/picture">
+                  <pic:nvPicPr>
+                    <pic:cNvPr id="1343994225" name="Picture 1" descr="The code defines a function to create and store a medical appointment in a list, checking for a non-empty patient name.&#10;&#10;AI-generated content may be incorrect."/>
+                    <pic:cNvPicPr/>
+                  </pic:nvPicPr>
+                  <pic:blipFill>
+                    <a:blip r:embed="rId6"/>
+                    <a:stretch>
+                      <a:fillRect/>
+                    </a:stretch>
+                  </pic:blipFill>
+                  <pic:spPr>
+                    <a:xfrm>
+                      <a:off x="0" y="0"/>
+                      <a:ext cx="6400800" cy="5956935"/>
+                    </a:xfrm>
+                    <a:prstGeom prst="rect">
+                      <a:avLst/>
+                    </a:prstGeom>
+                  </pic:spPr>
+                </pic:pic>
+              </a:graphicData>
+            </a:graphic>
+          </wp:inline>
+        </w:drawing>
+      </w:r>
+    </w:p>
+    <w:p>
+      <w:r>
+        <w:lastRenderedPageBreak/>
+        <w:drawing>
+          <wp:inline distT="0" distB="0" distL="0" distR="0" wp14:anchorId="02D39EFD" wp14:editId="09939260">
+            <wp:extent cx="6400800" cy="5698490"/>
+            <wp:effectExtent l="0" t="0" r="0" b="0"/>
+            <wp:docPr id="137273865" name="Picture 1" descr="The image depicts a list of three limitations and three suggested improvements for a function that manages appointments.&#10;&#10;AI-generated content may be incorrect."/>
+            <wp:cNvGraphicFramePr>
+              <a:graphicFrameLocks xmlns:a="http://schemas.openxmlformats.org/drawingml/2006/main" noChangeAspect="1"/>
+            </wp:cNvGraphicFramePr>
+            <a:graphic xmlns:a="http://schemas.openxmlformats.org/drawingml/2006/main">
+              <a:graphicData uri="http://schemas.openxmlformats.org/drawingml/2006/picture">
+                <pic:pic xmlns:pic="http://schemas.openxmlformats.org/drawingml/2006/picture">
+                  <pic:nvPicPr>
+                    <pic:cNvPr id="137273865" name="Picture 1" descr="The image depicts a list of three limitations and three suggested improvements for a function that manages appointments.&#10;&#10;AI-generated content may be incorrect."/>
+                    <pic:cNvPicPr/>
+                  </pic:nvPicPr>
+                  <pic:blipFill>
+                    <a:blip r:embed="rId7"/>
+                    <a:stretch>
+                      <a:fillRect/>
+                    </a:stretch>
+                  </pic:blipFill>
+                  <pic:spPr>
+                    <a:xfrm>
+                      <a:off x="0" y="0"/>
+                      <a:ext cx="6400800" cy="5698490"/>
+                    </a:xfrm>
+                    <a:prstGeom prst="rect">
+                      <a:avLst/>
+                    </a:prstGeom>
+                  </pic:spPr>
+                </pic:pic>
+              </a:graphicData>
+            </a:graphic>
+          </wp:inline>
+        </w:drawing>
+      </w:r>
+    </w:p>
+    <w:p>
+      <w:r>
+        <w:t>The two questions Copilot asked</w:t>
+      </w:r>
+      <w:r>
+        <w:t>:</w:t>
+      </w:r>
+    </w:p>
+    <w:p>
+      <w:pPr>
+        <w:pStyle w:val="ListParagraph"/>
+        <w:numPr>
+          <w:ilvl w:val="0"/>
+          <w:numId w:val="11"/>
+        </w:numPr>
+      </w:pPr>
+      <w:r>
+        <w:t>Why is it risky to rely on a global list like appointments without checking whether it exists?</w:t>
+      </w:r>
+    </w:p>
+    <w:p>
+      <w:pPr>
+        <w:pStyle w:val="ListParagraph"/>
+      </w:pPr>
+      <w:r>
+        <w:t>It is risky because if the appointments list has not been created before the function is called, the program will produce a NameError and stop</w:t>
+      </w:r>
+    </w:p>
+    <w:p>
+      <w:pPr>
+        <w:pStyle w:val="ListParagraph"/>
+      </w:pPr>
+    </w:p>
+    <w:p>
+      <w:pPr>
+        <w:pStyle w:val="ListParagraph"/>
+        <w:numPr>
+          <w:ilvl w:val="0"/>
+          <w:numId w:val="11"/>
+        </w:numPr>
+      </w:pPr>
+      <w:r>
+        <w:t>What advantage do you gain by returning the appointment dictionary from the function?</w:t>
+      </w:r>
+    </w:p>
+    <w:p>
+      <w:pPr>
+        <w:pStyle w:val="ListParagraph"/>
+      </w:pPr>
+      <w:r>
+        <w:t>Returning the appointment dictionary allows the part of the program that called the function to confirm what was created and use the appointment information elsewhere</w:t>
+      </w:r>
+    </w:p>
+    <w:p>
       <w:pPr>
         <w:pStyle w:val="Heading1"/>
       </w:pPr>
       <w:r>
-        <w:t>Part D - Generate an Alternative: AI ON</w:t>
+        <w:t>P</w:t>
+      </w:r>
+      <w:r>
+        <w:t>art D - Generate an Alternative: AI ON</w:t>
       </w:r>
     </w:p>
     <w:p>
@@ -1047,198 +1257,645 @@
       </w:r>
     </w:p>
     <w:p>
+      <w:r>
+        <w:t>Copilot code and response:</w:t>
+      </w:r>
+    </w:p>
+    <w:p>
+      <w:r>
+        <w:lastRenderedPageBreak/>
+        <w:t>appointments = []</w:t>
+      </w:r>
+    </w:p>
+    <w:p/>
+    <w:p>
+      <w:r>
+        <w:t>def book_appointment(patient_name, practitioner_name, appointment_time):</w:t>
+      </w:r>
+    </w:p>
+    <w:p>
+      <w:r>
+        <w:t xml:space="preserve">    """Store a basic appointment in a list."""</w:t>
+      </w:r>
+    </w:p>
+    <w:p>
+      <w:r>
+        <w:t xml:space="preserve">    </w:t>
+      </w:r>
+    </w:p>
+    <w:p>
+      <w:r>
+        <w:t xml:space="preserve">    appointment = {</w:t>
+      </w:r>
+    </w:p>
+    <w:p>
+      <w:r>
+        <w:t xml:space="preserve">        "patient": patient_name,</w:t>
+      </w:r>
+    </w:p>
+    <w:p>
+      <w:r>
+        <w:t xml:space="preserve">        "practitioner": practitioner_name,</w:t>
+      </w:r>
+    </w:p>
+    <w:p>
+      <w:r>
+        <w:t xml:space="preserve">        "time": appointment_time</w:t>
+      </w:r>
+    </w:p>
+    <w:p>
+      <w:r>
+        <w:t xml:space="preserve">    }</w:t>
+      </w:r>
+    </w:p>
+    <w:p>
+      <w:r>
+        <w:t xml:space="preserve">    </w:t>
+      </w:r>
+    </w:p>
+    <w:p>
+      <w:r>
+        <w:t xml:space="preserve">    appointments.append(appointment)</w:t>
+      </w:r>
+    </w:p>
+    <w:p>
+      <w:r>
+        <w:t xml:space="preserve">    return appointment</w:t>
+      </w:r>
+    </w:p>
+    <w:p>
+      <w:r>
+        <w:drawing>
+          <wp:inline distT="0" distB="0" distL="0" distR="0" wp14:anchorId="79A7F4D3" wp14:editId="1E6EBC74">
+            <wp:extent cx="4924231" cy="4457700"/>
+            <wp:effectExtent l="0" t="0" r="0" b="0"/>
+            <wp:docPr id="429956480" name="Picture 1"/>
+            <wp:cNvGraphicFramePr>
+              <a:graphicFrameLocks xmlns:a="http://schemas.openxmlformats.org/drawingml/2006/main" noChangeAspect="1"/>
+            </wp:cNvGraphicFramePr>
+            <a:graphic xmlns:a="http://schemas.openxmlformats.org/drawingml/2006/main">
+              <a:graphicData uri="http://schemas.openxmlformats.org/drawingml/2006/picture">
+                <pic:pic xmlns:pic="http://schemas.openxmlformats.org/drawingml/2006/picture">
+                  <pic:nvPicPr>
+                    <pic:cNvPr id="429956480" name=""/>
+                    <pic:cNvPicPr/>
+                  </pic:nvPicPr>
+                  <pic:blipFill>
+                    <a:blip r:embed="rId8"/>
+                    <a:stretch>
+                      <a:fillRect/>
+                    </a:stretch>
+                  </pic:blipFill>
+                  <pic:spPr>
+                    <a:xfrm>
+                      <a:off x="0" y="0"/>
+                      <a:ext cx="4930751" cy="4463602"/>
+                    </a:xfrm>
+                    <a:prstGeom prst="rect">
+                      <a:avLst/>
+                    </a:prstGeom>
+                  </pic:spPr>
+                </pic:pic>
+              </a:graphicData>
+            </a:graphic>
+          </wp:inline>
+        </w:drawing>
+      </w:r>
+    </w:p>
+    <w:p>
       <w:pPr>
         <w:pStyle w:val="Heading1"/>
       </w:pPr>
       <w:r>
+        <w:lastRenderedPageBreak/>
         <w:t>Part E - Compare Human and AI Versions</w:t>
       </w:r>
     </w:p>
     <w:tbl>
       <w:tblPr>
-        <w:tblStyle w:val="TableGrid"/>
         <w:tblW w:w="0" w:type="auto"/>
+        <w:tblCellSpacing w:w="15" w:type="dxa"/>
+        <w:tblInd w:w="45" w:type="dxa"/>
+        <w:tblBorders>
+          <w:top w:val="single" w:sz="4" w:space="0" w:color="auto"/>
+          <w:left w:val="single" w:sz="4" w:space="0" w:color="auto"/>
+          <w:bottom w:val="single" w:sz="4" w:space="0" w:color="auto"/>
+          <w:right w:val="single" w:sz="4" w:space="0" w:color="auto"/>
+          <w:insideH w:val="single" w:sz="4" w:space="0" w:color="auto"/>
+          <w:insideV w:val="single" w:sz="4" w:space="0" w:color="auto"/>
+        </w:tblBorders>
+        <w:tblCellMar>
+          <w:top w:w="15" w:type="dxa"/>
+          <w:left w:w="15" w:type="dxa"/>
+          <w:bottom w:w="15" w:type="dxa"/>
+          <w:right w:w="15" w:type="dxa"/>
+        </w:tblCellMar>
         <w:tblLook w:val="04A0" w:firstRow="1" w:lastRow="0" w:firstColumn="1" w:lastColumn="0" w:noHBand="0" w:noVBand="1"/>
       </w:tblPr>
       <w:tblGrid>
-        <w:gridCol w:w="3360"/>
-        <w:gridCol w:w="3360"/>
-        <w:gridCol w:w="3360"/>
+        <w:gridCol w:w="2068"/>
+        <w:gridCol w:w="4793"/>
+        <w:gridCol w:w="3284"/>
       </w:tblGrid>
       <w:tr>
+        <w:trPr>
+          <w:tblHeader/>
+          <w:tblCellSpacing w:w="15" w:type="dxa"/>
+        </w:trPr>
         <w:tc>
           <w:tcPr>
-            <w:tcW w:w="3360" w:type="dxa"/>
+            <w:tcW w:w="0" w:type="auto"/>
+            <w:vAlign w:val="center"/>
+            <w:hideMark/>
           </w:tcPr>
           <w:p>
+            <w:pPr>
+              <w:spacing w:after="0" w:line="240" w:lineRule="auto"/>
+              <w:rPr>
+                <w:b/>
+                <w:bCs/>
+                <w:lang w:val="en-AU"/>
+              </w:rPr>
+            </w:pPr>
             <w:r>
+              <w:rPr>
+                <w:b/>
+                <w:bCs/>
+                <w:lang w:val="en-AU"/>
+              </w:rPr>
               <w:t>Question</w:t>
             </w:r>
           </w:p>
         </w:tc>
         <w:tc>
           <w:tcPr>
-            <w:tcW w:w="3360" w:type="dxa"/>
+            <w:tcW w:w="0" w:type="auto"/>
+            <w:vAlign w:val="center"/>
+            <w:hideMark/>
           </w:tcPr>
           <w:p>
+            <w:pPr>
+              <w:spacing w:after="0" w:line="240" w:lineRule="auto"/>
+              <w:rPr>
+                <w:b/>
+                <w:bCs/>
+                <w:lang w:val="en-AU"/>
+              </w:rPr>
+            </w:pPr>
             <w:r>
+              <w:rPr>
+                <w:b/>
+                <w:bCs/>
+                <w:lang w:val="en-AU"/>
+              </w:rPr>
               <w:t>Human version</w:t>
             </w:r>
           </w:p>
         </w:tc>
         <w:tc>
           <w:tcPr>
-            <w:tcW w:w="3360" w:type="dxa"/>
+            <w:tcW w:w="0" w:type="auto"/>
+            <w:vAlign w:val="center"/>
+            <w:hideMark/>
           </w:tcPr>
           <w:p>
+            <w:pPr>
+              <w:spacing w:after="0" w:line="240" w:lineRule="auto"/>
+              <w:rPr>
+                <w:b/>
+                <w:bCs/>
+                <w:lang w:val="en-AU"/>
+              </w:rPr>
+            </w:pPr>
             <w:r>
+              <w:rPr>
+                <w:b/>
+                <w:bCs/>
+                <w:lang w:val="en-AU"/>
+              </w:rPr>
               <w:t>AI version</w:t>
             </w:r>
           </w:p>
         </w:tc>
       </w:tr>
       <w:tr>
+        <w:trPr>
+          <w:tblCellSpacing w:w="15" w:type="dxa"/>
+        </w:trPr>
         <w:tc>
           <w:tcPr>
-            <w:tcW w:w="3360" w:type="dxa"/>
+            <w:tcW w:w="0" w:type="auto"/>
+            <w:vAlign w:val="center"/>
+            <w:hideMark/>
           </w:tcPr>
           <w:p>
+            <w:pPr>
+              <w:spacing w:after="0" w:line="240" w:lineRule="auto"/>
+              <w:rPr>
+                <w:lang w:val="en-AU"/>
+              </w:rPr>
+            </w:pPr>
             <w:r>
+              <w:rPr>
+                <w:b/>
+                <w:bCs/>
+                <w:lang w:val="en-AU"/>
+              </w:rPr>
               <w:t>Easy to understand?</w:t>
             </w:r>
           </w:p>
         </w:tc>
         <w:tc>
           <w:tcPr>
-            <w:tcW w:w="3360" w:type="dxa"/>
+            <w:tcW w:w="0" w:type="auto"/>
+            <w:vAlign w:val="center"/>
+            <w:hideMark/>
           </w:tcPr>
-          <w:p/>
+          <w:p>
+            <w:pPr>
+              <w:spacing w:after="0" w:line="240" w:lineRule="auto"/>
+              <w:rPr>
+                <w:lang w:val="en-AU"/>
+              </w:rPr>
+            </w:pPr>
+            <w:r>
+              <w:rPr>
+                <w:lang w:val="en-AU"/>
+              </w:rPr>
+              <w:t>Yes, although it is more verbose because it includes validation and the appointment display function.</w:t>
+            </w:r>
+          </w:p>
         </w:tc>
         <w:tc>
           <w:tcPr>
-            <w:tcW w:w="3360" w:type="dxa"/>
+            <w:tcW w:w="0" w:type="auto"/>
+            <w:vAlign w:val="center"/>
+            <w:hideMark/>
           </w:tcPr>
-          <w:p/>
+          <w:p>
+            <w:pPr>
+              <w:spacing w:after="0" w:line="240" w:lineRule="auto"/>
+              <w:rPr>
+                <w:lang w:val="en-AU"/>
+              </w:rPr>
+            </w:pPr>
+            <w:r>
+              <w:rPr>
+                <w:lang w:val="en-AU"/>
+              </w:rPr>
+              <w:t>Yes, it is simple and easy to understand.</w:t>
+            </w:r>
+          </w:p>
         </w:tc>
       </w:tr>
       <w:tr>
+        <w:trPr>
+          <w:tblCellSpacing w:w="15" w:type="dxa"/>
+        </w:trPr>
         <w:tc>
           <w:tcPr>
-            <w:tcW w:w="3360" w:type="dxa"/>
+            <w:tcW w:w="0" w:type="auto"/>
+            <w:vAlign w:val="center"/>
+            <w:hideMark/>
           </w:tcPr>
           <w:p>
+            <w:pPr>
+              <w:spacing w:after="0" w:line="240" w:lineRule="auto"/>
+              <w:rPr>
+                <w:lang w:val="en-AU"/>
+              </w:rPr>
+            </w:pPr>
             <w:r>
+              <w:rPr>
+                <w:b/>
+                <w:bCs/>
+                <w:lang w:val="en-AU"/>
+              </w:rPr>
               <w:t>Runs successfully?</w:t>
             </w:r>
           </w:p>
         </w:tc>
         <w:tc>
           <w:tcPr>
-            <w:tcW w:w="3360" w:type="dxa"/>
+            <w:tcW w:w="0" w:type="auto"/>
+            <w:vAlign w:val="center"/>
+            <w:hideMark/>
           </w:tcPr>
-          <w:p/>
+          <w:p>
+            <w:pPr>
+              <w:spacing w:after="0" w:line="240" w:lineRule="auto"/>
+              <w:rPr>
+                <w:lang w:val="en-AU"/>
+              </w:rPr>
+            </w:pPr>
+            <w:r>
+              <w:rPr>
+                <w:lang w:val="en-AU"/>
+              </w:rPr>
+              <w:t>Yes</w:t>
+            </w:r>
+          </w:p>
         </w:tc>
         <w:tc>
           <w:tcPr>
-            <w:tcW w:w="3360" w:type="dxa"/>
+            <w:tcW w:w="0" w:type="auto"/>
+            <w:vAlign w:val="center"/>
+            <w:hideMark/>
           </w:tcPr>
-          <w:p/>
+          <w:p>
+            <w:pPr>
+              <w:spacing w:after="0" w:line="240" w:lineRule="auto"/>
+              <w:rPr>
+                <w:lang w:val="en-AU"/>
+              </w:rPr>
+            </w:pPr>
+            <w:r>
+              <w:rPr>
+                <w:lang w:val="en-AU"/>
+              </w:rPr>
+              <w:t>Yes, provided the appointments list exists.</w:t>
+            </w:r>
+          </w:p>
         </w:tc>
       </w:tr>
       <w:tr>
+        <w:trPr>
+          <w:tblCellSpacing w:w="15" w:type="dxa"/>
+        </w:trPr>
         <w:tc>
           <w:tcPr>
-            <w:tcW w:w="3360" w:type="dxa"/>
+            <w:tcW w:w="0" w:type="auto"/>
+            <w:vAlign w:val="center"/>
+            <w:hideMark/>
           </w:tcPr>
           <w:p>
+            <w:pPr>
+              <w:spacing w:after="0" w:line="240" w:lineRule="auto"/>
+              <w:rPr>
+                <w:lang w:val="en-AU"/>
+              </w:rPr>
+            </w:pPr>
             <w:r>
+              <w:rPr>
+                <w:b/>
+                <w:bCs/>
+                <w:lang w:val="en-AU"/>
+              </w:rPr>
               <w:t>Uses only required features?</w:t>
             </w:r>
           </w:p>
         </w:tc>
         <w:tc>
           <w:tcPr>
-            <w:tcW w:w="3360" w:type="dxa"/>
+            <w:tcW w:w="0" w:type="auto"/>
+            <w:vAlign w:val="center"/>
+            <w:hideMark/>
           </w:tcPr>
-          <w:p/>
+          <w:p>
+            <w:pPr>
+              <w:spacing w:after="0" w:line="240" w:lineRule="auto"/>
+              <w:rPr>
+                <w:lang w:val="en-AU"/>
+              </w:rPr>
+            </w:pPr>
+            <w:r>
+              <w:rPr>
+                <w:lang w:val="en-AU"/>
+              </w:rPr>
+              <w:t>Yes</w:t>
+            </w:r>
+          </w:p>
         </w:tc>
         <w:tc>
           <w:tcPr>
-            <w:tcW w:w="3360" w:type="dxa"/>
+            <w:tcW w:w="0" w:type="auto"/>
+            <w:vAlign w:val="center"/>
+            <w:hideMark/>
           </w:tcPr>
-          <w:p/>
+          <w:p>
+            <w:pPr>
+              <w:spacing w:after="0" w:line="240" w:lineRule="auto"/>
+              <w:rPr>
+                <w:lang w:val="en-AU"/>
+              </w:rPr>
+            </w:pPr>
+            <w:r>
+              <w:rPr>
+                <w:lang w:val="en-AU"/>
+              </w:rPr>
+              <w:t>Yes</w:t>
+            </w:r>
+          </w:p>
         </w:tc>
       </w:tr>
       <w:tr>
+        <w:trPr>
+          <w:tblCellSpacing w:w="15" w:type="dxa"/>
+        </w:trPr>
         <w:tc>
           <w:tcPr>
-            <w:tcW w:w="3360" w:type="dxa"/>
+            <w:tcW w:w="0" w:type="auto"/>
+            <w:vAlign w:val="center"/>
+            <w:hideMark/>
           </w:tcPr>
           <w:p>
+            <w:pPr>
+              <w:spacing w:after="0" w:line="240" w:lineRule="auto"/>
+              <w:rPr>
+                <w:lang w:val="en-AU"/>
+              </w:rPr>
+            </w:pPr>
             <w:r>
+              <w:rPr>
+                <w:b/>
+                <w:bCs/>
+                <w:lang w:val="en-AU"/>
+              </w:rPr>
               <w:t>Adds assumptions?</w:t>
             </w:r>
           </w:p>
         </w:tc>
         <w:tc>
           <w:tcPr>
-            <w:tcW w:w="3360" w:type="dxa"/>
+            <w:tcW w:w="0" w:type="auto"/>
+            <w:vAlign w:val="center"/>
+            <w:hideMark/>
           </w:tcPr>
-          <w:p/>
+          <w:p>
+            <w:pPr>
+              <w:spacing w:after="0" w:line="240" w:lineRule="auto"/>
+              <w:rPr>
+                <w:lang w:val="en-AU"/>
+              </w:rPr>
+            </w:pPr>
+            <w:r>
+              <w:rPr>
+                <w:lang w:val="en-AU"/>
+              </w:rPr>
+              <w:t>No major assumptions</w:t>
+            </w:r>
+          </w:p>
         </w:tc>
         <w:tc>
           <w:tcPr>
-            <w:tcW w:w="3360" w:type="dxa"/>
+            <w:tcW w:w="0" w:type="auto"/>
+            <w:vAlign w:val="center"/>
+            <w:hideMark/>
           </w:tcPr>
-          <w:p/>
+          <w:p>
+            <w:pPr>
+              <w:spacing w:after="0" w:line="240" w:lineRule="auto"/>
+              <w:rPr>
+                <w:lang w:val="en-AU"/>
+              </w:rPr>
+            </w:pPr>
+            <w:r>
+              <w:rPr>
+                <w:lang w:val="en-AU"/>
+              </w:rPr>
+              <w:t>Yes — it assumes an appointments list already exists.</w:t>
+            </w:r>
+          </w:p>
         </w:tc>
       </w:tr>
       <w:tr>
+        <w:trPr>
+          <w:tblCellSpacing w:w="15" w:type="dxa"/>
+        </w:trPr>
         <w:tc>
           <w:tcPr>
-            <w:tcW w:w="3360" w:type="dxa"/>
+            <w:tcW w:w="0" w:type="auto"/>
+            <w:vAlign w:val="center"/>
+            <w:hideMark/>
           </w:tcPr>
           <w:p>
+            <w:pPr>
+              <w:spacing w:after="0" w:line="240" w:lineRule="auto"/>
+              <w:rPr>
+                <w:lang w:val="en-AU"/>
+              </w:rPr>
+            </w:pPr>
             <w:r>
+              <w:rPr>
+                <w:b/>
+                <w:bCs/>
+                <w:lang w:val="en-AU"/>
+              </w:rPr>
               <w:t>Handles errors?</w:t>
             </w:r>
           </w:p>
         </w:tc>
         <w:tc>
           <w:tcPr>
-            <w:tcW w:w="3360" w:type="dxa"/>
+            <w:tcW w:w="0" w:type="auto"/>
+            <w:vAlign w:val="center"/>
+            <w:hideMark/>
           </w:tcPr>
-          <w:p/>
+          <w:p>
+            <w:pPr>
+              <w:spacing w:after="0" w:line="240" w:lineRule="auto"/>
+              <w:rPr>
+                <w:lang w:val="en-AU"/>
+              </w:rPr>
+            </w:pPr>
+            <w:r>
+              <w:rPr>
+                <w:lang w:val="en-AU"/>
+              </w:rPr>
+              <w:t>Yes, it checks for an empty patient name.</w:t>
+            </w:r>
+          </w:p>
         </w:tc>
         <w:tc>
           <w:tcPr>
-            <w:tcW w:w="3360" w:type="dxa"/>
+            <w:tcW w:w="0" w:type="auto"/>
+            <w:vAlign w:val="center"/>
+            <w:hideMark/>
           </w:tcPr>
-          <w:p/>
+          <w:p>
+            <w:pPr>
+              <w:spacing w:after="0" w:line="240" w:lineRule="auto"/>
+              <w:rPr>
+                <w:lang w:val="en-AU"/>
+              </w:rPr>
+            </w:pPr>
+            <w:r>
+              <w:rPr>
+                <w:lang w:val="en-AU"/>
+              </w:rPr>
+              <w:t>No, it has no input validation or error checking.</w:t>
+            </w:r>
+          </w:p>
         </w:tc>
       </w:tr>
       <w:tr>
+        <w:trPr>
+          <w:tblCellSpacing w:w="15" w:type="dxa"/>
+        </w:trPr>
         <w:tc>
           <w:tcPr>
-            <w:tcW w:w="3360" w:type="dxa"/>
+            <w:tcW w:w="0" w:type="auto"/>
+            <w:vAlign w:val="center"/>
+            <w:hideMark/>
           </w:tcPr>
           <w:p>
+            <w:pPr>
+              <w:spacing w:after="0" w:line="240" w:lineRule="auto"/>
+              <w:rPr>
+                <w:lang w:val="en-AU"/>
+              </w:rPr>
+            </w:pPr>
             <w:r>
+              <w:rPr>
+                <w:b/>
+                <w:bCs/>
+                <w:lang w:val="en-AU"/>
+              </w:rPr>
               <w:t>Could I explain it?</w:t>
             </w:r>
           </w:p>
         </w:tc>
         <w:tc>
           <w:tcPr>
-            <w:tcW w:w="3360" w:type="dxa"/>
+            <w:tcW w:w="0" w:type="auto"/>
+            <w:vAlign w:val="center"/>
+            <w:hideMark/>
           </w:tcPr>
-          <w:p/>
+          <w:p>
+            <w:pPr>
+              <w:spacing w:after="0" w:line="240" w:lineRule="auto"/>
+              <w:rPr>
+                <w:lang w:val="en-AU"/>
+              </w:rPr>
+            </w:pPr>
+            <w:r>
+              <w:rPr>
+                <w:lang w:val="en-AU"/>
+              </w:rPr>
+              <w:t>Yes</w:t>
+            </w:r>
+          </w:p>
         </w:tc>
         <w:tc>
           <w:tcPr>
-            <w:tcW w:w="3360" w:type="dxa"/>
+            <w:tcW w:w="0" w:type="auto"/>
+            <w:vAlign w:val="center"/>
+            <w:hideMark/>
           </w:tcPr>
-          <w:p/>
+          <w:p>
+            <w:pPr>
+              <w:spacing w:after="0" w:line="240" w:lineRule="auto"/>
+              <w:rPr>
+                <w:lang w:val="en-AU"/>
+              </w:rPr>
+            </w:pPr>
+            <w:r>
+              <w:rPr>
+                <w:lang w:val="en-AU"/>
+              </w:rPr>
+              <w:t>Yes, after reviewing how the list, dictionary and function work.</w:t>
+            </w:r>
+          </w:p>
         </w:tc>
       </w:tr>
     </w:tbl>
@@ -1281,6 +1938,505 @@
       <w:r>
         <w:t>Strange input such as patient_name=None or appointment_time=None</w:t>
       </w:r>
+    </w:p>
+    <w:p>
+      <w:pPr>
+        <w:pStyle w:val="ListBullet"/>
+        <w:numPr>
+          <w:ilvl w:val="0"/>
+          <w:numId w:val="0"/>
+        </w:numPr>
+        <w:ind w:left="360" w:hanging="360"/>
+      </w:pPr>
+    </w:p>
+    <w:tbl>
+      <w:tblPr>
+        <w:tblW w:w="0" w:type="auto"/>
+        <w:tblCellSpacing w:w="15" w:type="dxa"/>
+        <w:tblBorders>
+          <w:top w:val="single" w:sz="4" w:space="0" w:color="auto"/>
+          <w:left w:val="single" w:sz="4" w:space="0" w:color="auto"/>
+          <w:bottom w:val="single" w:sz="4" w:space="0" w:color="auto"/>
+          <w:right w:val="single" w:sz="4" w:space="0" w:color="auto"/>
+          <w:insideH w:val="single" w:sz="4" w:space="0" w:color="auto"/>
+          <w:insideV w:val="single" w:sz="4" w:space="0" w:color="auto"/>
+        </w:tblBorders>
+        <w:tblCellMar>
+          <w:top w:w="15" w:type="dxa"/>
+          <w:left w:w="15" w:type="dxa"/>
+          <w:bottom w:w="15" w:type="dxa"/>
+          <w:right w:w="15" w:type="dxa"/>
+        </w:tblCellMar>
+        <w:tblLook w:val="04A0" w:firstRow="1" w:lastRow="0" w:firstColumn="1" w:lastColumn="0" w:noHBand="0" w:noVBand="1"/>
+      </w:tblPr>
+      <w:tblGrid>
+        <w:gridCol w:w="3183"/>
+        <w:gridCol w:w="4432"/>
+        <w:gridCol w:w="2575"/>
+      </w:tblGrid>
+      <w:tr>
+        <w:trPr>
+          <w:tblHeader/>
+          <w:tblCellSpacing w:w="15" w:type="dxa"/>
+        </w:trPr>
+        <w:tc>
+          <w:tcPr>
+            <w:tcW w:w="0" w:type="auto"/>
+            <w:vAlign w:val="center"/>
+            <w:hideMark/>
+          </w:tcPr>
+          <w:p>
+            <w:pPr>
+              <w:pStyle w:val="ListBullet"/>
+              <w:numPr>
+                <w:ilvl w:val="0"/>
+                <w:numId w:val="0"/>
+              </w:numPr>
+              <w:rPr>
+                <w:b/>
+                <w:bCs/>
+                <w:lang w:val="en-AU"/>
+              </w:rPr>
+            </w:pPr>
+            <w:r>
+              <w:rPr>
+                <w:b/>
+                <w:bCs/>
+                <w:lang w:val="en-AU"/>
+              </w:rPr>
+              <w:t>Test</w:t>
+            </w:r>
+          </w:p>
+        </w:tc>
+        <w:tc>
+          <w:tcPr>
+            <w:tcW w:w="0" w:type="auto"/>
+            <w:vAlign w:val="center"/>
+            <w:hideMark/>
+          </w:tcPr>
+          <w:p>
+            <w:pPr>
+              <w:pStyle w:val="ListBullet"/>
+              <w:numPr>
+                <w:ilvl w:val="0"/>
+                <w:numId w:val="0"/>
+              </w:numPr>
+              <w:rPr>
+                <w:b/>
+                <w:bCs/>
+                <w:lang w:val="en-AU"/>
+              </w:rPr>
+            </w:pPr>
+            <w:r>
+              <w:rPr>
+                <w:b/>
+                <w:bCs/>
+                <w:lang w:val="en-AU"/>
+              </w:rPr>
+              <w:t>Human version</w:t>
+            </w:r>
+          </w:p>
+        </w:tc>
+        <w:tc>
+          <w:tcPr>
+            <w:tcW w:w="0" w:type="auto"/>
+            <w:vAlign w:val="center"/>
+            <w:hideMark/>
+          </w:tcPr>
+          <w:p>
+            <w:pPr>
+              <w:pStyle w:val="ListBullet"/>
+              <w:numPr>
+                <w:ilvl w:val="0"/>
+                <w:numId w:val="0"/>
+              </w:numPr>
+              <w:rPr>
+                <w:b/>
+                <w:bCs/>
+                <w:lang w:val="en-AU"/>
+              </w:rPr>
+            </w:pPr>
+            <w:r>
+              <w:rPr>
+                <w:b/>
+                <w:bCs/>
+                <w:lang w:val="en-AU"/>
+              </w:rPr>
+              <w:t>AI version</w:t>
+            </w:r>
+          </w:p>
+        </w:tc>
+      </w:tr>
+      <w:tr>
+        <w:trPr>
+          <w:tblCellSpacing w:w="15" w:type="dxa"/>
+        </w:trPr>
+        <w:tc>
+          <w:tcPr>
+            <w:tcW w:w="0" w:type="auto"/>
+            <w:vAlign w:val="center"/>
+            <w:hideMark/>
+          </w:tcPr>
+          <w:p>
+            <w:pPr>
+              <w:pStyle w:val="ListBullet"/>
+              <w:numPr>
+                <w:ilvl w:val="0"/>
+                <w:numId w:val="0"/>
+              </w:numPr>
+              <w:rPr>
+                <w:lang w:val="en-AU"/>
+              </w:rPr>
+            </w:pPr>
+            <w:r>
+              <w:rPr>
+                <w:b/>
+                <w:bCs/>
+                <w:lang w:val="en-AU"/>
+              </w:rPr>
+              <w:t>Normal appointment</w:t>
+            </w:r>
+          </w:p>
+        </w:tc>
+        <w:tc>
+          <w:tcPr>
+            <w:tcW w:w="0" w:type="auto"/>
+            <w:vAlign w:val="center"/>
+            <w:hideMark/>
+          </w:tcPr>
+          <w:p>
+            <w:pPr>
+              <w:pStyle w:val="ListBullet"/>
+              <w:numPr>
+                <w:ilvl w:val="0"/>
+                <w:numId w:val="0"/>
+              </w:numPr>
+              <w:rPr>
+                <w:lang w:val="en-AU"/>
+              </w:rPr>
+            </w:pPr>
+            <w:r>
+              <w:rPr>
+                <w:lang w:val="en-AU"/>
+              </w:rPr>
+              <w:t>Works — appointment is stored and displayed.</w:t>
+            </w:r>
+          </w:p>
+        </w:tc>
+        <w:tc>
+          <w:tcPr>
+            <w:tcW w:w="0" w:type="auto"/>
+            <w:vAlign w:val="center"/>
+            <w:hideMark/>
+          </w:tcPr>
+          <w:p>
+            <w:pPr>
+              <w:pStyle w:val="ListBullet"/>
+              <w:numPr>
+                <w:ilvl w:val="0"/>
+                <w:numId w:val="0"/>
+              </w:numPr>
+              <w:rPr>
+                <w:lang w:val="en-AU"/>
+              </w:rPr>
+            </w:pPr>
+            <w:r>
+              <w:rPr>
+                <w:lang w:val="en-AU"/>
+              </w:rPr>
+              <w:t>Works — appointment is stored and returned.</w:t>
+            </w:r>
+          </w:p>
+        </w:tc>
+      </w:tr>
+      <w:tr>
+        <w:trPr>
+          <w:tblCellSpacing w:w="15" w:type="dxa"/>
+        </w:trPr>
+        <w:tc>
+          <w:tcPr>
+            <w:tcW w:w="0" w:type="auto"/>
+            <w:vAlign w:val="center"/>
+            <w:hideMark/>
+          </w:tcPr>
+          <w:p>
+            <w:pPr>
+              <w:pStyle w:val="ListBullet"/>
+              <w:numPr>
+                <w:ilvl w:val="0"/>
+                <w:numId w:val="0"/>
+              </w:numPr>
+              <w:rPr>
+                <w:lang w:val="en-AU"/>
+              </w:rPr>
+            </w:pPr>
+            <w:r>
+              <w:rPr>
+                <w:b/>
+                <w:bCs/>
+                <w:lang w:val="en-AU"/>
+              </w:rPr>
+              <w:t>Blank patient name</w:t>
+            </w:r>
+          </w:p>
+        </w:tc>
+        <w:tc>
+          <w:tcPr>
+            <w:tcW w:w="0" w:type="auto"/>
+            <w:vAlign w:val="center"/>
+            <w:hideMark/>
+          </w:tcPr>
+          <w:p>
+            <w:pPr>
+              <w:pStyle w:val="ListBullet"/>
+              <w:numPr>
+                <w:ilvl w:val="0"/>
+                <w:numId w:val="0"/>
+              </w:numPr>
+              <w:rPr>
+                <w:lang w:val="en-AU"/>
+              </w:rPr>
+            </w:pPr>
+            <w:r>
+              <w:rPr>
+                <w:b/>
+                <w:bCs/>
+                <w:lang w:val="en-AU"/>
+              </w:rPr>
+              <w:t>Rejected</w:t>
+            </w:r>
+            <w:r>
+              <w:rPr>
+                <w:lang w:val="en-AU"/>
+              </w:rPr>
+              <w:t xml:space="preserve"> — raises ValueError.</w:t>
+            </w:r>
+          </w:p>
+        </w:tc>
+        <w:tc>
+          <w:tcPr>
+            <w:tcW w:w="0" w:type="auto"/>
+            <w:vAlign w:val="center"/>
+            <w:hideMark/>
+          </w:tcPr>
+          <w:p>
+            <w:pPr>
+              <w:pStyle w:val="ListBullet"/>
+              <w:numPr>
+                <w:ilvl w:val="0"/>
+                <w:numId w:val="0"/>
+              </w:numPr>
+              <w:rPr>
+                <w:lang w:val="en-AU"/>
+              </w:rPr>
+            </w:pPr>
+            <w:r>
+              <w:rPr>
+                <w:b/>
+                <w:bCs/>
+                <w:lang w:val="en-AU"/>
+              </w:rPr>
+              <w:t>Accepted</w:t>
+            </w:r>
+            <w:r>
+              <w:rPr>
+                <w:lang w:val="en-AU"/>
+              </w:rPr>
+              <w:t xml:space="preserve"> — no validation is performed.</w:t>
+            </w:r>
+          </w:p>
+        </w:tc>
+      </w:tr>
+      <w:tr>
+        <w:trPr>
+          <w:tblCellSpacing w:w="15" w:type="dxa"/>
+        </w:trPr>
+        <w:tc>
+          <w:tcPr>
+            <w:tcW w:w="0" w:type="auto"/>
+            <w:vAlign w:val="center"/>
+            <w:hideMark/>
+          </w:tcPr>
+          <w:p>
+            <w:pPr>
+              <w:pStyle w:val="ListBullet"/>
+              <w:numPr>
+                <w:ilvl w:val="0"/>
+                <w:numId w:val="0"/>
+              </w:numPr>
+              <w:rPr>
+                <w:lang w:val="en-AU"/>
+              </w:rPr>
+            </w:pPr>
+            <w:r>
+              <w:rPr>
+                <w:b/>
+                <w:bCs/>
+                <w:lang w:val="en-AU"/>
+              </w:rPr>
+              <w:t>Two appointments for the same practitioner/time</w:t>
+            </w:r>
+          </w:p>
+        </w:tc>
+        <w:tc>
+          <w:tcPr>
+            <w:tcW w:w="0" w:type="auto"/>
+            <w:vAlign w:val="center"/>
+            <w:hideMark/>
+          </w:tcPr>
+          <w:p>
+            <w:pPr>
+              <w:pStyle w:val="ListBullet"/>
+              <w:numPr>
+                <w:ilvl w:val="0"/>
+                <w:numId w:val="0"/>
+              </w:numPr>
+              <w:rPr>
+                <w:lang w:val="en-AU"/>
+              </w:rPr>
+            </w:pPr>
+            <w:r>
+              <w:rPr>
+                <w:b/>
+                <w:bCs/>
+                <w:lang w:val="en-AU"/>
+              </w:rPr>
+              <w:t>Accepted</w:t>
+            </w:r>
+            <w:r>
+              <w:rPr>
+                <w:lang w:val="en-AU"/>
+              </w:rPr>
+              <w:t xml:space="preserve"> — there is no duplicate/conflict check.</w:t>
+            </w:r>
+          </w:p>
+        </w:tc>
+        <w:tc>
+          <w:tcPr>
+            <w:tcW w:w="0" w:type="auto"/>
+            <w:vAlign w:val="center"/>
+            <w:hideMark/>
+          </w:tcPr>
+          <w:p>
+            <w:pPr>
+              <w:pStyle w:val="ListBullet"/>
+              <w:numPr>
+                <w:ilvl w:val="0"/>
+                <w:numId w:val="0"/>
+              </w:numPr>
+              <w:rPr>
+                <w:lang w:val="en-AU"/>
+              </w:rPr>
+            </w:pPr>
+            <w:r>
+              <w:rPr>
+                <w:b/>
+                <w:bCs/>
+                <w:lang w:val="en-AU"/>
+              </w:rPr>
+              <w:t>Accepted</w:t>
+            </w:r>
+            <w:r>
+              <w:rPr>
+                <w:lang w:val="en-AU"/>
+              </w:rPr>
+              <w:t xml:space="preserve"> — there is no duplicate/conflict check.</w:t>
+            </w:r>
+          </w:p>
+        </w:tc>
+      </w:tr>
+      <w:tr>
+        <w:trPr>
+          <w:tblCellSpacing w:w="15" w:type="dxa"/>
+        </w:trPr>
+        <w:tc>
+          <w:tcPr>
+            <w:tcW w:w="0" w:type="auto"/>
+            <w:vAlign w:val="center"/>
+            <w:hideMark/>
+          </w:tcPr>
+          <w:p>
+            <w:pPr>
+              <w:pStyle w:val="ListBullet"/>
+              <w:numPr>
+                <w:ilvl w:val="0"/>
+                <w:numId w:val="0"/>
+              </w:numPr>
+              <w:rPr>
+                <w:lang w:val="en-AU"/>
+              </w:rPr>
+            </w:pPr>
+            <w:r>
+              <w:rPr>
+                <w:b/>
+                <w:bCs/>
+                <w:lang w:val="en-AU"/>
+              </w:rPr>
+              <w:t>patient_name=None or appointment_time=None</w:t>
+            </w:r>
+          </w:p>
+        </w:tc>
+        <w:tc>
+          <w:tcPr>
+            <w:tcW w:w="0" w:type="auto"/>
+            <w:vAlign w:val="center"/>
+            <w:hideMark/>
+          </w:tcPr>
+          <w:p>
+            <w:pPr>
+              <w:pStyle w:val="ListBullet"/>
+              <w:numPr>
+                <w:ilvl w:val="0"/>
+                <w:numId w:val="0"/>
+              </w:numPr>
+              <w:rPr>
+                <w:lang w:val="en-AU"/>
+              </w:rPr>
+            </w:pPr>
+            <w:r>
+              <w:rPr>
+                <w:lang w:val="en-AU"/>
+              </w:rPr>
+              <w:t>patient_name=None is rejected because it is treated as empty; appointment_time=None is accepted.</w:t>
+            </w:r>
+          </w:p>
+        </w:tc>
+        <w:tc>
+          <w:tcPr>
+            <w:tcW w:w="0" w:type="auto"/>
+            <w:vAlign w:val="center"/>
+            <w:hideMark/>
+          </w:tcPr>
+          <w:p>
+            <w:pPr>
+              <w:pStyle w:val="ListBullet"/>
+              <w:numPr>
+                <w:ilvl w:val="0"/>
+                <w:numId w:val="0"/>
+              </w:numPr>
+              <w:rPr>
+                <w:lang w:val="en-AU"/>
+              </w:rPr>
+            </w:pPr>
+            <w:r>
+              <w:rPr>
+                <w:lang w:val="en-AU"/>
+              </w:rPr>
+              <w:t>Both are accepted because there is no validation.</w:t>
+            </w:r>
+          </w:p>
+        </w:tc>
+      </w:tr>
+    </w:tbl>
+    <w:p>
+      <w:pPr>
+        <w:pStyle w:val="ListBullet"/>
+        <w:numPr>
+          <w:ilvl w:val="0"/>
+          <w:numId w:val="0"/>
+        </w:numPr>
+        <w:ind w:left="360" w:hanging="360"/>
+      </w:pPr>
     </w:p>
     <w:p>
       <w:pPr>
@@ -1296,10 +2452,16 @@
       </w:r>
     </w:p>
     <w:p>
+      <w:r>
+        <w:t>I improved the program by adding validation for an empty practitioner name. This prevents an appointment from being stored without a practitioner and improves the reliability of the prototype.</w:t>
+      </w:r>
+    </w:p>
+    <w:p>
       <w:pPr>
         <w:pStyle w:val="Heading1"/>
       </w:pPr>
       <w:r>
+        <w:lastRenderedPageBreak/>
         <w:t>Part H - Reflection (150-250 words)</w:t>
       </w:r>
     </w:p>
@@ -1320,13 +2482,33 @@
     </w:p>
     <w:p>
       <w:r>
-        <w:lastRenderedPageBreak/>
         <w:t>How did you verify the AI output?</w:t>
       </w:r>
     </w:p>
     <w:p>
       <w:r>
         <w:t>What engineering work remained for you?</w:t>
+      </w:r>
+    </w:p>
+    <w:p/>
+    <w:p>
+      <w:r>
+        <w:t>Before using AI, I built a simple SmartCare appointment prototype using Python. I used a list and dictionaries to store patient names, practitioner names and appointment times, and created functions to book and display appointments. I also added validation to prevent an empty patient name and later added one controlled improvement to validate the practitioner name.</w:t>
+      </w:r>
+    </w:p>
+    <w:p>
+      <w:r>
+        <w:t>AI helped me understand how the booking function works and identified limitations such as the need for the appointments list to already exist, limited input validation and the lack of feedback from the function. AI also suggested improvements such as input validation and duplicate appointment checking.</w:t>
+      </w:r>
+    </w:p>
+    <w:p>
+      <w:r>
+        <w:t>The AI-generated version made an assumption that an appointments list already existed and did not include validation. I did not automatically accept the AI output. I verified its suggestions by reading the code, running the program and testing normal and unusual inputs, including blank and None values and duplicate appointments.</w:t>
+      </w:r>
+    </w:p>
+    <w:p>
+      <w:r>
+        <w:t>The engineering work that remained for me was deciding which suggestions were appropriate, testing the behaviour and making the final controlled improvement. This showed me that AI can help explain and suggest ideas, but I still need to understand, evaluate and verify the code myself.</w:t>
       </w:r>
     </w:p>
     <w:p>
@@ -1399,7 +2581,7 @@
 </file>
 
 <file path=word/numbering.xml><?xml version="1.0" encoding="utf-8"?>
-<w:numbering xmlns:wpc="http://schemas.microsoft.com/office/word/2010/wordprocessingCanvas" xmlns:cx="http://schemas.microsoft.com/office/drawing/2014/chartex" xmlns:cx1="http://schemas.microsoft.com/office/drawing/2015/9/8/chartex" xmlns:cx2="http://schemas.microsoft.com/office/drawing/2015/10/21/chartex" xmlns:cx3="http://schemas.microsoft.com/office/drawing/2016/5/9/chartex" xmlns:cx4="http://schemas.microsoft.com/office/drawing/2016/5/10/chartex" xmlns:cx5="http://schemas.microsoft.com/office/drawing/2016/5/11/chartex" xmlns:cx6="http://schemas.microsoft.com/office/drawing/2016/5/12/chartex" xmlns:cx7="http://schemas.microsoft.com/office/drawing/2016/5/13/chartex" xmlns:cx8="http://schemas.microsoft.com/office/drawing/2016/5/14/chartex" xmlns:mc="http://schemas.openxmlformats.org/markup-compatibility/2006" xmlns:aink="http://schemas.microsoft.com/office/drawing/2016/ink" xmlns:am3d="http://schemas.microsoft.com/office/drawing/2017/model3d" xmlns:o="urn:schemas-microsoft-com:office:office" xmlns:oel="http://schemas.microsoft.com/office/2019/extlst" xmlns:r="http://schemas.openxmlformats.org/officeDocument/2006/relationships" xmlns:m="http://schemas.openxmlformats.org/officeDocument/2006/math" xmlns:v="urn:schemas-microsoft-com:vml" xmlns:wp14="http://schemas.microsoft.com/office/word/2010/wordprocessingDrawing" xmlns:wp="http://schemas.openxmlformats.org/drawingml/2006/wordprocessingDrawing" xmlns:w10="urn:schemas-microsoft-com:office:word" xmlns:w="http://schemas.openxmlformats.org/wordprocessingml/2006/main" xmlns:w14="http://schemas.microsoft.com/office/word/2010/wordml" xmlns:w15="http://schemas.microsoft.com/office/word/2012/wordml" xmlns:w16cei="http://schemas.microsoft.com/office/word/2026/wordml/cei" xmlns:w16cex="http://schemas.microsoft.com/office/word/2018/wordml/cex" xmlns:w16cid="http://schemas.microsoft.com/office/word/2016/wordml/cid" xmlns:w16="http://schemas.microsoft.com/office/word/2018/wordml" xmlns:w16du="http://schemas.microsoft.com/office/word/2023/wordml/word16du" xmlns:w16sdtdh="http://schemas.microsoft.com/office/word/2020/wordml/sdtdatahash" xmlns:w16sdtfl="http://schemas.microsoft.com/office/word/2024/wordml/sdtformatlock" xmlns:w16se="http://schemas.microsoft.com/office/word/2015/wordml/symex" xmlns:wpg="http://schemas.microsoft.com/office/word/2010/wordprocessingGroup" xmlns:wpi="http://schemas.microsoft.com/office/word/2010/wordprocessingInk" xmlns:wne="http://schemas.microsoft.com/office/word/2006/wordml" xmlns:wps="http://schemas.microsoft.com/office/word/2010/wordprocessingShape" mc:Ignorable="w14 w15 w16se w16cid w16 w16cex w16sdtdh w16sdtfl w16du wp14">
+<w:numbering xmlns:wpc="http://schemas.microsoft.com/office/word/2010/wordprocessingCanvas" xmlns:cx="http://schemas.microsoft.com/office/drawing/2014/chartex" xmlns:cx1="http://schemas.microsoft.com/office/drawing/2015/9/8/chartex" xmlns:cx2="http://schemas.microsoft.com/office/drawing/2015/10/21/chartex" xmlns:cx3="http://schemas.microsoft.com/office/drawing/2016/5/9/chartex" xmlns:cx4="http://schemas.microsoft.com/office/drawing/2016/5/10/chartex" xmlns:cx5="http://schemas.microsoft.com/office/drawing/2016/5/11/chartex" xmlns:cx6="http://schemas.microsoft.com/office/drawing/2016/5/12/chartex" xmlns:cx7="http://schemas.microsoft.com/office/drawing/2016/5/13/chartex" xmlns:cx8="http://schemas.microsoft.com/office/drawing/2016/5/14/chartex" xmlns:mc="http://schemas.openxmlformats.org/markup-compatibility/2006" xmlns:aink="http://schemas.microsoft.com/office/drawing/2016/ink" xmlns:am3d="http://schemas.microsoft.com/office/drawing/2017/model3d" xmlns:o="urn:schemas-microsoft-com:office:office" xmlns:oel="http://schemas.microsoft.com/office/2019/extlst" xmlns:r="http://schemas.openxmlformats.org/officeDocument/2006/relationships" xmlns:m="http://schemas.openxmlformats.org/officeDocument/2006/math" xmlns:v="urn:schemas-microsoft-com:vml" xmlns:wp14="http://schemas.microsoft.com/office/word/2010/wordprocessingDrawing" xmlns:wp="http://schemas.openxmlformats.org/drawingml/2006/wordprocessingDrawing" xmlns:w10="urn:schemas-microsoft-com:office:word" xmlns:w="http://schemas.openxmlformats.org/wordprocessingml/2006/main" xmlns:w14="http://schemas.microsoft.com/office/word/2010/wordml" xmlns:w15="http://schemas.microsoft.com/office/word/2012/wordml" xmlns:w16cex="http://schemas.microsoft.com/office/word/2018/wordml/cex" xmlns:w16cid="http://schemas.microsoft.com/office/word/2016/wordml/cid" xmlns:w16="http://schemas.microsoft.com/office/word/2018/wordml" xmlns:w16du="http://schemas.microsoft.com/office/word/2023/wordml/word16du" xmlns:w16sdtdh="http://schemas.microsoft.com/office/word/2020/wordml/sdtdatahash" xmlns:w16sdtfl="http://schemas.microsoft.com/office/word/2024/wordml/sdtformatlock" xmlns:w16se="http://schemas.microsoft.com/office/word/2015/wordml/symex" xmlns:wpg="http://schemas.microsoft.com/office/word/2010/wordprocessingGroup" xmlns:wpi="http://schemas.microsoft.com/office/word/2010/wordprocessingInk" xmlns:wne="http://schemas.microsoft.com/office/word/2006/wordml" xmlns:wps="http://schemas.microsoft.com/office/word/2010/wordprocessingShape" mc:Ignorable="w14 w15 w16se w16cid w16 w16cex w16sdtdh w16sdtfl w16du wp14">
   <w:abstractNum w:abstractNumId="0" w15:restartNumberingAfterBreak="0">
     <w:nsid w:val="FFFFFF7C"/>
     <w:multiLevelType w:val="singleLevel"/>
@@ -1568,6 +2750,294 @@
       </w:pPr>
       <w:rPr>
         <w:rFonts w:ascii="Symbol" w:hAnsi="Symbol" w:hint="default"/>
+      </w:rPr>
+    </w:lvl>
+  </w:abstractNum>
+  <w:abstractNum w:abstractNumId="9" w15:restartNumberingAfterBreak="0">
+    <w:nsid w:val="31D276FA"/>
+    <w:multiLevelType w:val="hybridMultilevel"/>
+    <w:tmpl w:val="BF107E1E"/>
+    <w:lvl w:ilvl="0" w:tplc="0C09000F">
+      <w:start w:val="1"/>
+      <w:numFmt w:val="decimal"/>
+      <w:lvlText w:val="%1."/>
+      <w:lvlJc w:val="left"/>
+      <w:pPr>
+        <w:ind w:left="720" w:hanging="360"/>
+      </w:pPr>
+      <w:rPr>
+        <w:rFonts w:hint="default"/>
+      </w:rPr>
+    </w:lvl>
+    <w:lvl w:ilvl="1" w:tplc="0C090019" w:tentative="1">
+      <w:start w:val="1"/>
+      <w:numFmt w:val="lowerLetter"/>
+      <w:lvlText w:val="%2."/>
+      <w:lvlJc w:val="left"/>
+      <w:pPr>
+        <w:ind w:left="1440" w:hanging="360"/>
+      </w:pPr>
+    </w:lvl>
+    <w:lvl w:ilvl="2" w:tplc="0C09001B" w:tentative="1">
+      <w:start w:val="1"/>
+      <w:numFmt w:val="lowerRoman"/>
+      <w:lvlText w:val="%3."/>
+      <w:lvlJc w:val="right"/>
+      <w:pPr>
+        <w:ind w:left="2160" w:hanging="180"/>
+      </w:pPr>
+    </w:lvl>
+    <w:lvl w:ilvl="3" w:tplc="0C09000F" w:tentative="1">
+      <w:start w:val="1"/>
+      <w:numFmt w:val="decimal"/>
+      <w:lvlText w:val="%4."/>
+      <w:lvlJc w:val="left"/>
+      <w:pPr>
+        <w:ind w:left="2880" w:hanging="360"/>
+      </w:pPr>
+    </w:lvl>
+    <w:lvl w:ilvl="4" w:tplc="0C090019" w:tentative="1">
+      <w:start w:val="1"/>
+      <w:numFmt w:val="lowerLetter"/>
+      <w:lvlText w:val="%5."/>
+      <w:lvlJc w:val="left"/>
+      <w:pPr>
+        <w:ind w:left="3600" w:hanging="360"/>
+      </w:pPr>
+    </w:lvl>
+    <w:lvl w:ilvl="5" w:tplc="0C09001B" w:tentative="1">
+      <w:start w:val="1"/>
+      <w:numFmt w:val="lowerRoman"/>
+      <w:lvlText w:val="%6."/>
+      <w:lvlJc w:val="right"/>
+      <w:pPr>
+        <w:ind w:left="4320" w:hanging="180"/>
+      </w:pPr>
+    </w:lvl>
+    <w:lvl w:ilvl="6" w:tplc="0C09000F" w:tentative="1">
+      <w:start w:val="1"/>
+      <w:numFmt w:val="decimal"/>
+      <w:lvlText w:val="%7."/>
+      <w:lvlJc w:val="left"/>
+      <w:pPr>
+        <w:ind w:left="5040" w:hanging="360"/>
+      </w:pPr>
+    </w:lvl>
+    <w:lvl w:ilvl="7" w:tplc="0C090019" w:tentative="1">
+      <w:start w:val="1"/>
+      <w:numFmt w:val="lowerLetter"/>
+      <w:lvlText w:val="%8."/>
+      <w:lvlJc w:val="left"/>
+      <w:pPr>
+        <w:ind w:left="5760" w:hanging="360"/>
+      </w:pPr>
+    </w:lvl>
+    <w:lvl w:ilvl="8" w:tplc="0C09001B" w:tentative="1">
+      <w:start w:val="1"/>
+      <w:numFmt w:val="lowerRoman"/>
+      <w:lvlText w:val="%9."/>
+      <w:lvlJc w:val="right"/>
+      <w:pPr>
+        <w:ind w:left="6480" w:hanging="180"/>
+      </w:pPr>
+    </w:lvl>
+  </w:abstractNum>
+  <w:abstractNum w:abstractNumId="10" w15:restartNumberingAfterBreak="0">
+    <w:nsid w:val="61E565BE"/>
+    <w:multiLevelType w:val="hybridMultilevel"/>
+    <w:tmpl w:val="EA10069C"/>
+    <w:lvl w:ilvl="0" w:tplc="0C09000F">
+      <w:start w:val="1"/>
+      <w:numFmt w:val="decimal"/>
+      <w:lvlText w:val="%1."/>
+      <w:lvlJc w:val="left"/>
+      <w:pPr>
+        <w:ind w:left="720" w:hanging="360"/>
+      </w:pPr>
+    </w:lvl>
+    <w:lvl w:ilvl="1" w:tplc="0C090019" w:tentative="1">
+      <w:start w:val="1"/>
+      <w:numFmt w:val="lowerLetter"/>
+      <w:lvlText w:val="%2."/>
+      <w:lvlJc w:val="left"/>
+      <w:pPr>
+        <w:ind w:left="1440" w:hanging="360"/>
+      </w:pPr>
+    </w:lvl>
+    <w:lvl w:ilvl="2" w:tplc="0C09001B" w:tentative="1">
+      <w:start w:val="1"/>
+      <w:numFmt w:val="lowerRoman"/>
+      <w:lvlText w:val="%3."/>
+      <w:lvlJc w:val="right"/>
+      <w:pPr>
+        <w:ind w:left="2160" w:hanging="180"/>
+      </w:pPr>
+    </w:lvl>
+    <w:lvl w:ilvl="3" w:tplc="0C09000F" w:tentative="1">
+      <w:start w:val="1"/>
+      <w:numFmt w:val="decimal"/>
+      <w:lvlText w:val="%4."/>
+      <w:lvlJc w:val="left"/>
+      <w:pPr>
+        <w:ind w:left="2880" w:hanging="360"/>
+      </w:pPr>
+    </w:lvl>
+    <w:lvl w:ilvl="4" w:tplc="0C090019" w:tentative="1">
+      <w:start w:val="1"/>
+      <w:numFmt w:val="lowerLetter"/>
+      <w:lvlText w:val="%5."/>
+      <w:lvlJc w:val="left"/>
+      <w:pPr>
+        <w:ind w:left="3600" w:hanging="360"/>
+      </w:pPr>
+    </w:lvl>
+    <w:lvl w:ilvl="5" w:tplc="0C09001B" w:tentative="1">
+      <w:start w:val="1"/>
+      <w:numFmt w:val="lowerRoman"/>
+      <w:lvlText w:val="%6."/>
+      <w:lvlJc w:val="right"/>
+      <w:pPr>
+        <w:ind w:left="4320" w:hanging="180"/>
+      </w:pPr>
+    </w:lvl>
+    <w:lvl w:ilvl="6" w:tplc="0C09000F" w:tentative="1">
+      <w:start w:val="1"/>
+      <w:numFmt w:val="decimal"/>
+      <w:lvlText w:val="%7."/>
+      <w:lvlJc w:val="left"/>
+      <w:pPr>
+        <w:ind w:left="5040" w:hanging="360"/>
+      </w:pPr>
+    </w:lvl>
+    <w:lvl w:ilvl="7" w:tplc="0C090019" w:tentative="1">
+      <w:start w:val="1"/>
+      <w:numFmt w:val="lowerLetter"/>
+      <w:lvlText w:val="%8."/>
+      <w:lvlJc w:val="left"/>
+      <w:pPr>
+        <w:ind w:left="5760" w:hanging="360"/>
+      </w:pPr>
+    </w:lvl>
+    <w:lvl w:ilvl="8" w:tplc="0C09001B" w:tentative="1">
+      <w:start w:val="1"/>
+      <w:numFmt w:val="lowerRoman"/>
+      <w:lvlText w:val="%9."/>
+      <w:lvlJc w:val="right"/>
+      <w:pPr>
+        <w:ind w:left="6480" w:hanging="180"/>
+      </w:pPr>
+    </w:lvl>
+  </w:abstractNum>
+  <w:abstractNum w:abstractNumId="11" w15:restartNumberingAfterBreak="0">
+    <w:nsid w:val="6FBD0414"/>
+    <w:multiLevelType w:val="hybridMultilevel"/>
+    <w:tmpl w:val="615ED9EC"/>
+    <w:lvl w:ilvl="0" w:tplc="0C090001">
+      <w:start w:val="1"/>
+      <w:numFmt w:val="bullet"/>
+      <w:lvlText w:val=""/>
+      <w:lvlJc w:val="left"/>
+      <w:pPr>
+        <w:ind w:left="720" w:hanging="360"/>
+      </w:pPr>
+      <w:rPr>
+        <w:rFonts w:ascii="Symbol" w:hAnsi="Symbol" w:hint="default"/>
+      </w:rPr>
+    </w:lvl>
+    <w:lvl w:ilvl="1" w:tplc="0C090003" w:tentative="1">
+      <w:start w:val="1"/>
+      <w:numFmt w:val="bullet"/>
+      <w:lvlText w:val="o"/>
+      <w:lvlJc w:val="left"/>
+      <w:pPr>
+        <w:ind w:left="1440" w:hanging="360"/>
+      </w:pPr>
+      <w:rPr>
+        <w:rFonts w:ascii="Courier New" w:hAnsi="Courier New" w:cs="Courier New" w:hint="default"/>
+      </w:rPr>
+    </w:lvl>
+    <w:lvl w:ilvl="2" w:tplc="0C090005" w:tentative="1">
+      <w:start w:val="1"/>
+      <w:numFmt w:val="bullet"/>
+      <w:lvlText w:val=""/>
+      <w:lvlJc w:val="left"/>
+      <w:pPr>
+        <w:ind w:left="2160" w:hanging="360"/>
+      </w:pPr>
+      <w:rPr>
+        <w:rFonts w:ascii="Wingdings" w:hAnsi="Wingdings" w:hint="default"/>
+      </w:rPr>
+    </w:lvl>
+    <w:lvl w:ilvl="3" w:tplc="0C090001" w:tentative="1">
+      <w:start w:val="1"/>
+      <w:numFmt w:val="bullet"/>
+      <w:lvlText w:val=""/>
+      <w:lvlJc w:val="left"/>
+      <w:pPr>
+        <w:ind w:left="2880" w:hanging="360"/>
+      </w:pPr>
+      <w:rPr>
+        <w:rFonts w:ascii="Symbol" w:hAnsi="Symbol" w:hint="default"/>
+      </w:rPr>
+    </w:lvl>
+    <w:lvl w:ilvl="4" w:tplc="0C090003" w:tentative="1">
+      <w:start w:val="1"/>
+      <w:numFmt w:val="bullet"/>
+      <w:lvlText w:val="o"/>
+      <w:lvlJc w:val="left"/>
+      <w:pPr>
+        <w:ind w:left="3600" w:hanging="360"/>
+      </w:pPr>
+      <w:rPr>
+        <w:rFonts w:ascii="Courier New" w:hAnsi="Courier New" w:cs="Courier New" w:hint="default"/>
+      </w:rPr>
+    </w:lvl>
+    <w:lvl w:ilvl="5" w:tplc="0C090005" w:tentative="1">
+      <w:start w:val="1"/>
+      <w:numFmt w:val="bullet"/>
+      <w:lvlText w:val=""/>
+      <w:lvlJc w:val="left"/>
+      <w:pPr>
+        <w:ind w:left="4320" w:hanging="360"/>
+      </w:pPr>
+      <w:rPr>
+        <w:rFonts w:ascii="Wingdings" w:hAnsi="Wingdings" w:hint="default"/>
+      </w:rPr>
+    </w:lvl>
+    <w:lvl w:ilvl="6" w:tplc="0C090001" w:tentative="1">
+      <w:start w:val="1"/>
+      <w:numFmt w:val="bullet"/>
+      <w:lvlText w:val=""/>
+      <w:lvlJc w:val="left"/>
+      <w:pPr>
+        <w:ind w:left="5040" w:hanging="360"/>
+      </w:pPr>
+      <w:rPr>
+        <w:rFonts w:ascii="Symbol" w:hAnsi="Symbol" w:hint="default"/>
+      </w:rPr>
+    </w:lvl>
+    <w:lvl w:ilvl="7" w:tplc="0C090003" w:tentative="1">
+      <w:start w:val="1"/>
+      <w:numFmt w:val="bullet"/>
+      <w:lvlText w:val="o"/>
+      <w:lvlJc w:val="left"/>
+      <w:pPr>
+        <w:ind w:left="5760" w:hanging="360"/>
+      </w:pPr>
+      <w:rPr>
+        <w:rFonts w:ascii="Courier New" w:hAnsi="Courier New" w:cs="Courier New" w:hint="default"/>
+      </w:rPr>
+    </w:lvl>
+    <w:lvl w:ilvl="8" w:tplc="0C090005" w:tentative="1">
+      <w:start w:val="1"/>
+      <w:numFmt w:val="bullet"/>
+      <w:lvlText w:val=""/>
+      <w:lvlJc w:val="left"/>
+      <w:pPr>
+        <w:ind w:left="6480" w:hanging="360"/>
+      </w:pPr>
+      <w:rPr>
+        <w:rFonts w:ascii="Wingdings" w:hAnsi="Wingdings" w:hint="default"/>
       </w:rPr>
     </w:lvl>
   </w:abstractNum>
@@ -1597,6 +3067,15 @@
   </w:num>
   <w:num w:numId="9" w16cid:durableId="1202792164">
     <w:abstractNumId w:val="0"/>
+  </w:num>
+  <w:num w:numId="10" w16cid:durableId="2082867242">
+    <w:abstractNumId w:val="10"/>
+  </w:num>
+  <w:num w:numId="11" w16cid:durableId="121198750">
+    <w:abstractNumId w:val="9"/>
+  </w:num>
+  <w:num w:numId="12" w16cid:durableId="1252008450">
+    <w:abstractNumId w:val="11"/>
   </w:num>
 </w:numbering>
 </file>
@@ -2208,7 +3687,6 @@
   <w:style w:type="character" w:default="1" w:styleId="DefaultParagraphFont">
     <w:name w:val="Default Paragraph Font"/>
     <w:uiPriority w:val="1"/>
-    <w:semiHidden/>
     <w:unhideWhenUsed/>
   </w:style>
   <w:style w:type="table" w:default="1" w:styleId="TableNormal">

</xml_diff>